<commit_message>
chore: add lean manufacturing documents and dashboard spreadsheet
</commit_message>
<xml_diff>
--- a/OI/00_lean_ss/Qu&#039;est-ce qu&#039;une entreprise.docx
+++ b/OI/00_lean_ss/Qu&#039;est-ce qu&#039;une entreprise.docx
@@ -137,13 +137,8 @@
         <w:ind w:left="2340"/>
         <w:textAlignment w:val="baseline"/>
       </w:pPr>
-      <w:proofErr w:type="gramStart"/>
-      <w:r>
-        <w:t>ressources</w:t>
-      </w:r>
-      <w:proofErr w:type="gramEnd"/>
-      <w:r>
-        <w:t xml:space="preserve"> internes : personnel, bâtiments, matériel possédé…</w:t>
+      <w:r>
+        <w:t>ressources internes : personnel, bâtiments, matériel possédé…</w:t>
       </w:r>
     </w:p>
     <w:p>
@@ -157,13 +152,8 @@
         <w:ind w:left="2340"/>
         <w:textAlignment w:val="baseline"/>
       </w:pPr>
-      <w:proofErr w:type="gramStart"/>
-      <w:r>
-        <w:t>ressources</w:t>
-      </w:r>
-      <w:proofErr w:type="gramEnd"/>
-      <w:r>
-        <w:t xml:space="preserve"> externes : sous-traitants, prestataires…</w:t>
+      <w:r>
+        <w:t>ressources externes : sous-traitants, prestataires…</w:t>
       </w:r>
     </w:p>
     <w:p>
@@ -222,13 +212,8 @@
         <w:ind w:left="2340"/>
         <w:textAlignment w:val="baseline"/>
       </w:pPr>
-      <w:proofErr w:type="gramStart"/>
-      <w:r>
-        <w:t>décisions</w:t>
-      </w:r>
-      <w:proofErr w:type="gramEnd"/>
-      <w:r>
-        <w:t xml:space="preserve"> marketing : elles s’appuient sur une analyse du marché, de l’environnement et de la concurrence, et consistent en la définition d’un </w:t>
+      <w:r>
+        <w:t>décisions marketing : elles s’appuient sur une analyse du marché, de l’environnement et de la concurrence, et consistent en la définition d’un </w:t>
       </w:r>
       <w:hyperlink r:id="rId8" w:tgtFrame="_blank" w:history="1">
         <w:r>
@@ -250,13 +235,8 @@
         <w:ind w:left="3510"/>
         <w:textAlignment w:val="baseline"/>
       </w:pPr>
-      <w:proofErr w:type="gramStart"/>
-      <w:r>
-        <w:t>quel</w:t>
-      </w:r>
-      <w:proofErr w:type="gramEnd"/>
-      <w:r>
-        <w:t xml:space="preserve"> produit ?</w:t>
+      <w:r>
+        <w:t>quel produit ?</w:t>
       </w:r>
     </w:p>
     <w:p>
@@ -270,13 +250,8 @@
         <w:ind w:left="3510"/>
         <w:textAlignment w:val="baseline"/>
       </w:pPr>
-      <w:proofErr w:type="gramStart"/>
-      <w:r>
-        <w:t>quel</w:t>
-      </w:r>
-      <w:proofErr w:type="gramEnd"/>
-      <w:r>
-        <w:t xml:space="preserve"> prix ?</w:t>
+      <w:r>
+        <w:t>quel prix ?</w:t>
       </w:r>
     </w:p>
     <w:p>
@@ -290,14 +265,9 @@
         <w:ind w:left="3510"/>
         <w:textAlignment w:val="baseline"/>
       </w:pPr>
-      <w:proofErr w:type="gramStart"/>
       <w:r>
         <w:lastRenderedPageBreak/>
-        <w:t>quel</w:t>
-      </w:r>
-      <w:proofErr w:type="gramEnd"/>
-      <w:r>
-        <w:t xml:space="preserve"> réseau de distribution ?</w:t>
+        <w:t>quel réseau de distribution ?</w:t>
       </w:r>
     </w:p>
     <w:p>
@@ -311,13 +281,8 @@
         <w:ind w:left="3510"/>
         <w:textAlignment w:val="baseline"/>
       </w:pPr>
-      <w:proofErr w:type="gramStart"/>
-      <w:r>
-        <w:t>quelle</w:t>
-      </w:r>
-      <w:proofErr w:type="gramEnd"/>
-      <w:r>
-        <w:t xml:space="preserve"> communication ?</w:t>
+      <w:r>
+        <w:t>quelle communication ?</w:t>
       </w:r>
     </w:p>
     <w:p>
@@ -331,13 +296,8 @@
         <w:ind w:left="2340"/>
         <w:textAlignment w:val="baseline"/>
       </w:pPr>
-      <w:proofErr w:type="gramStart"/>
-      <w:r>
-        <w:t>décisions</w:t>
-      </w:r>
-      <w:proofErr w:type="gramEnd"/>
-      <w:r>
-        <w:t xml:space="preserve"> organisationnelles : elles s’appuient sur une analyse des forces et faiblesses internes et consistent en une amélioration de la performance des différentes fonctions de l’entreprise,</w:t>
+      <w:r>
+        <w:t>décisions organisationnelles : elles s’appuient sur une analyse des forces et faiblesses internes et consistent en une amélioration de la performance des différentes fonctions de l’entreprise,</w:t>
       </w:r>
     </w:p>
     <w:p>
@@ -351,13 +311,8 @@
         <w:ind w:left="2340"/>
         <w:textAlignment w:val="baseline"/>
       </w:pPr>
-      <w:proofErr w:type="gramStart"/>
-      <w:r>
-        <w:t>décisions</w:t>
-      </w:r>
-      <w:proofErr w:type="gramEnd"/>
-      <w:r>
-        <w:t xml:space="preserve"> financières : elles s’appuient sur une analyse de la situation financière de l’entreprise mais aussi sur le diagnostic commercial et organisationnel, afin de déterminer les budgets et les investissements futurs.</w:t>
+      <w:r>
+        <w:t>décisions financières : elles s’appuient sur une analyse de la situation financière de l’entreprise mais aussi sur le diagnostic commercial et organisationnel, afin de déterminer les budgets et les investissements futurs.</w:t>
       </w:r>
     </w:p>
     <w:p/>
@@ -579,15 +534,7 @@
         <w:t>Les</w:t>
       </w:r>
       <w:r>
-        <w:t xml:space="preserve"> sociétés sont des personnes morales à part entière, créées par un ou plusieurs associés ou « actionnaires ». Les sociétés disposent de </w:t>
-      </w:r>
-      <w:proofErr w:type="gramStart"/>
-      <w:r>
-        <w:t>leur propres règles</w:t>
-      </w:r>
-      <w:proofErr w:type="gramEnd"/>
-      <w:r>
-        <w:t xml:space="preserve"> de fonctionnement (les statuts) et de leur propre patrimoine. Parmi les sociétés, on distingue des variantes :</w:t>
+        <w:t> sociétés sont des personnes morales à part entière, créées par un ou plusieurs associés ou « actionnaires ». Les sociétés disposent de leur propres règles de fonctionnement (les statuts) et de leur propre patrimoine. Parmi les sociétés, on distingue des variantes :</w:t>
       </w:r>
     </w:p>
     <w:p>
@@ -601,13 +548,8 @@
         <w:ind w:left="2340"/>
         <w:textAlignment w:val="baseline"/>
       </w:pPr>
-      <w:proofErr w:type="gramStart"/>
-      <w:r>
-        <w:t>les</w:t>
-      </w:r>
-      <w:proofErr w:type="gramEnd"/>
-      <w:r>
-        <w:t xml:space="preserve"> formes de sociétés par parts sociales : </w:t>
+      <w:r>
+        <w:t>les formes de sociétés par parts sociales : </w:t>
       </w:r>
       <w:hyperlink r:id="rId11" w:tgtFrame="_blank" w:history="1">
         <w:r>
@@ -637,13 +579,8 @@
         <w:ind w:left="2340"/>
         <w:textAlignment w:val="baseline"/>
       </w:pPr>
-      <w:proofErr w:type="gramStart"/>
-      <w:r>
-        <w:t>les</w:t>
-      </w:r>
-      <w:proofErr w:type="gramEnd"/>
-      <w:r>
-        <w:t xml:space="preserve"> formes de sociétés par actions : SA, </w:t>
+      <w:r>
+        <w:t>les formes de sociétés par actions : SA, </w:t>
       </w:r>
       <w:hyperlink r:id="rId13" w:tgtFrame="_blank" w:history="1">
         <w:r>
@@ -676,12 +613,6 @@
       </w:r>
     </w:p>
     <w:p>
-      <w:r>
-        <w:lastRenderedPageBreak/>
-        <w:t>A enrichir !</w:t>
-      </w:r>
-    </w:p>
-    <w:p>
       <w:pPr>
         <w:jc w:val="center"/>
       </w:pPr>
@@ -689,6 +620,7 @@
         <w:rPr>
           <w:noProof/>
         </w:rPr>
+        <w:lastRenderedPageBreak/>
         <w:drawing>
           <wp:inline distT="0" distB="0" distL="0" distR="0" wp14:anchorId="1C361003" wp14:editId="126DAC08">
             <wp:extent cx="5760720" cy="3086735"/>

</xml_diff>